<commit_message>
which interactions are probable
</commit_message>
<xml_diff>
--- a/results/10_iterations/canary/canaries_analysis_softimpute.docx
+++ b/results/10_iterations/canary/canaries_analysis_softimpute.docx
@@ -12,25 +12,14 @@
           <w:lang w:val="en-US"/>
         </w:rPr>
       </w:pPr>
-      <w:proofErr w:type="spellStart"/>
-      <w:r>
-        <w:rPr>
-          <w:rFonts w:ascii="David" w:hAnsi="David" w:cs="David"/>
-          <w:b/>
-          <w:bCs/>
-          <w:lang w:val="en-US"/>
-        </w:rPr>
-        <w:t>Softimpute</w:t>
-      </w:r>
-      <w:proofErr w:type="spellEnd"/>
-      <w:r>
-        <w:rPr>
-          <w:rFonts w:ascii="David" w:hAnsi="David" w:cs="David"/>
-          <w:b/>
-          <w:bCs/>
-          <w:lang w:val="en-US"/>
-        </w:rPr>
-        <w:t xml:space="preserve"> – </w:t>
+      <w:r>
+        <w:rPr>
+          <w:rFonts w:ascii="David" w:hAnsi="David" w:cs="David"/>
+          <w:b/>
+          <w:bCs/>
+          <w:lang w:val="en-US"/>
+        </w:rPr>
+        <w:t xml:space="preserve">Softimpute – </w:t>
       </w:r>
       <w:r>
         <w:rPr>
@@ -74,64 +63,7 @@
           <w:rFonts w:ascii="David" w:hAnsi="David" w:cs="David"/>
           <w:lang w:val="en-US"/>
         </w:rPr>
-        <w:t xml:space="preserve">Working code: </w:t>
-      </w:r>
-      <w:proofErr w:type="spellStart"/>
-      <w:r>
-        <w:rPr>
-          <w:rFonts w:ascii="David" w:hAnsi="David" w:cs="David"/>
-          <w:lang w:val="en-US"/>
-        </w:rPr>
-        <w:t>softimpute_</w:t>
-      </w:r>
-      <w:proofErr w:type="gramStart"/>
-      <w:r>
-        <w:rPr>
-          <w:rFonts w:ascii="David" w:hAnsi="David" w:cs="David"/>
-          <w:lang w:val="en-US"/>
-        </w:rPr>
-        <w:t>bootstrap.R</w:t>
-      </w:r>
-      <w:proofErr w:type="spellEnd"/>
-      <w:proofErr w:type="gramEnd"/>
-      <w:r>
-        <w:rPr>
-          <w:rFonts w:ascii="David" w:hAnsi="David" w:cs="David"/>
-          <w:lang w:val="en-US"/>
-        </w:rPr>
-        <w:t xml:space="preserve"> in the </w:t>
-      </w:r>
-      <w:proofErr w:type="spellStart"/>
-      <w:r>
-        <w:rPr>
-          <w:rFonts w:ascii="David" w:hAnsi="David" w:cs="David"/>
-          <w:lang w:val="en-US"/>
-        </w:rPr>
-        <w:t>softimpute</w:t>
-      </w:r>
-      <w:proofErr w:type="spellEnd"/>
-      <w:r>
-        <w:rPr>
-          <w:rFonts w:ascii="David" w:hAnsi="David" w:cs="David"/>
-          <w:lang w:val="en-US"/>
-        </w:rPr>
-        <w:t xml:space="preserve"> </w:t>
-      </w:r>
-      <w:proofErr w:type="spellStart"/>
-      <w:r>
-        <w:rPr>
-          <w:rFonts w:ascii="David" w:hAnsi="David" w:cs="David"/>
-          <w:lang w:val="en-US"/>
-        </w:rPr>
-        <w:t>github</w:t>
-      </w:r>
-      <w:proofErr w:type="spellEnd"/>
-      <w:r>
-        <w:rPr>
-          <w:rFonts w:ascii="David" w:hAnsi="David" w:cs="David"/>
-          <w:lang w:val="en-US"/>
-        </w:rPr>
-        <w:t xml:space="preserve"> repository</w:t>
+        <w:t>Working code: softimpute_bootstrap.R in the softimpute github repository</w:t>
       </w:r>
     </w:p>
     <w:p>
@@ -160,86 +92,22 @@
           <w:rFonts w:ascii="David" w:hAnsi="David" w:cs="David"/>
           <w:lang w:val="en-US"/>
         </w:rPr>
-        <w:t xml:space="preserve"> very large csv </w:t>
-      </w:r>
-      <w:proofErr w:type="gramStart"/>
-      <w:r>
-        <w:rPr>
-          <w:rFonts w:ascii="David" w:hAnsi="David" w:cs="David"/>
-          <w:lang w:val="en-US"/>
-        </w:rPr>
-        <w:t>files</w:t>
-      </w:r>
-      <w:proofErr w:type="gramEnd"/>
-      <w:r>
-        <w:rPr>
-          <w:rFonts w:ascii="David" w:hAnsi="David" w:cs="David"/>
-          <w:lang w:val="en-US"/>
-        </w:rPr>
-        <w:t xml:space="preserve"> for the pollination networks </w:t>
-      </w:r>
-      <w:proofErr w:type="spellStart"/>
-      <w:r>
-        <w:rPr>
-          <w:rFonts w:ascii="David" w:hAnsi="David" w:cs="David"/>
-          <w:lang w:val="en-US"/>
-        </w:rPr>
-        <w:t>inthe</w:t>
-      </w:r>
-      <w:proofErr w:type="spellEnd"/>
-      <w:r>
-        <w:rPr>
-          <w:rFonts w:ascii="David" w:hAnsi="David" w:cs="David"/>
-          <w:lang w:val="en-US"/>
-        </w:rPr>
-        <w:t xml:space="preserve"> Canary Islands (in the Google Drive Research folder), with 100 iterations for removing zeros.</w:t>
-      </w:r>
-    </w:p>
-    <w:p>
-      <w:pPr>
-        <w:rPr>
-          <w:rFonts w:ascii="David" w:hAnsi="David" w:cs="David"/>
-          <w:lang w:val="en-US"/>
-        </w:rPr>
-      </w:pPr>
-      <w:r>
-        <w:rPr>
-          <w:rFonts w:ascii="David" w:hAnsi="David" w:cs="David"/>
-          <w:lang w:val="en-US"/>
-        </w:rPr>
-        <w:t xml:space="preserve">The amount of removed zeros is equal to the </w:t>
-      </w:r>
-      <w:proofErr w:type="gramStart"/>
-      <w:r>
-        <w:rPr>
-          <w:rFonts w:ascii="David" w:hAnsi="David" w:cs="David"/>
-          <w:lang w:val="en-US"/>
-        </w:rPr>
-        <w:t>amount</w:t>
-      </w:r>
-      <w:proofErr w:type="gramEnd"/>
-      <w:r>
-        <w:rPr>
-          <w:rFonts w:ascii="David" w:hAnsi="David" w:cs="David"/>
-          <w:lang w:val="en-US"/>
-        </w:rPr>
-        <w:t xml:space="preserve"> of ones removed (which are 20% of ones). </w:t>
-      </w:r>
-      <w:proofErr w:type="gramStart"/>
-      <w:r>
-        <w:rPr>
-          <w:rFonts w:ascii="David" w:hAnsi="David" w:cs="David"/>
-          <w:lang w:val="en-US"/>
-        </w:rPr>
-        <w:t>Otherwise</w:t>
-      </w:r>
-      <w:proofErr w:type="gramEnd"/>
-      <w:r>
-        <w:rPr>
-          <w:rFonts w:ascii="David" w:hAnsi="David" w:cs="David"/>
-          <w:lang w:val="en-US"/>
-        </w:rPr>
-        <w:t xml:space="preserve"> the amount of removed zeros i</w:t>
+        <w:t xml:space="preserve"> very large csv files for the pollination networks inthe Canary Islands (in the Google Drive Research folder), with 100 iterations for removing zeros.</w:t>
+      </w:r>
+    </w:p>
+    <w:p>
+      <w:pPr>
+        <w:rPr>
+          <w:rFonts w:ascii="David" w:hAnsi="David" w:cs="David"/>
+          <w:lang w:val="en-US"/>
+        </w:rPr>
+      </w:pPr>
+      <w:r>
+        <w:rPr>
+          <w:rFonts w:ascii="David" w:hAnsi="David" w:cs="David"/>
+          <w:lang w:val="en-US"/>
+        </w:rPr>
+        <w:t>The amount of removed zeros is equal to the amount of ones removed (which are 20% of ones). Otherwise the amount of removed zeros i</w:t>
       </w:r>
       <w:r>
         <w:rPr>
@@ -268,48 +136,7 @@
           <w:rFonts w:ascii="David" w:hAnsi="David" w:cs="David"/>
           <w:lang w:val="en-US"/>
         </w:rPr>
-        <w:t xml:space="preserve">Analysis code: </w:t>
-      </w:r>
-      <w:proofErr w:type="spellStart"/>
-      <w:r>
-        <w:rPr>
-          <w:rFonts w:ascii="David" w:hAnsi="David" w:cs="David"/>
-          <w:lang w:val="en-US"/>
-        </w:rPr>
-        <w:t>brazil_canary_</w:t>
-      </w:r>
-      <w:proofErr w:type="gramStart"/>
-      <w:r>
-        <w:rPr>
-          <w:rFonts w:ascii="David" w:hAnsi="David" w:cs="David"/>
-          <w:lang w:val="en-US"/>
-        </w:rPr>
-        <w:t>analysis.R</w:t>
-      </w:r>
-      <w:proofErr w:type="spellEnd"/>
-      <w:proofErr w:type="gramEnd"/>
-      <w:r>
-        <w:rPr>
-          <w:rFonts w:ascii="David" w:hAnsi="David" w:cs="David"/>
-          <w:lang w:val="en-US"/>
-        </w:rPr>
-        <w:t xml:space="preserve"> in the </w:t>
-      </w:r>
-      <w:proofErr w:type="spellStart"/>
-      <w:r>
-        <w:rPr>
-          <w:rFonts w:ascii="David" w:hAnsi="David" w:cs="David"/>
-          <w:lang w:val="en-US"/>
-        </w:rPr>
-        <w:t>github</w:t>
-      </w:r>
-      <w:proofErr w:type="spellEnd"/>
-      <w:r>
-        <w:rPr>
-          <w:rFonts w:ascii="David" w:hAnsi="David" w:cs="David"/>
-          <w:lang w:val="en-US"/>
-        </w:rPr>
-        <w:t xml:space="preserve"> repository. </w:t>
+        <w:t xml:space="preserve">Analysis code: brazil_canary_analysis.R in the github repository. </w:t>
       </w:r>
     </w:p>
     <w:p>
@@ -488,23 +315,7 @@
           <w:rFonts w:ascii="David" w:hAnsi="David" w:cs="David"/>
           <w:lang w:val="en-US"/>
         </w:rPr>
-        <w:t xml:space="preserve">The same trends were observed for both Brazil and the Canary Islands; </w:t>
-      </w:r>
-      <w:proofErr w:type="gramStart"/>
-      <w:r>
-        <w:rPr>
-          <w:rFonts w:ascii="David" w:hAnsi="David" w:cs="David"/>
-          <w:lang w:val="en-US"/>
-        </w:rPr>
-        <w:t>therefore</w:t>
-      </w:r>
-      <w:proofErr w:type="gramEnd"/>
-      <w:r>
-        <w:rPr>
-          <w:rFonts w:ascii="David" w:hAnsi="David" w:cs="David"/>
-          <w:lang w:val="en-US"/>
-        </w:rPr>
-        <w:t xml:space="preserve"> I continued the analysis using only these values of k and lambda.</w:t>
+        <w:t>The same trends were observed for both Brazil and the Canary Islands; therefore I continued the analysis using only these values of k and lambda.</w:t>
       </w:r>
     </w:p>
     <w:p>
@@ -697,23 +508,7 @@
           <w:rFonts w:ascii="David" w:hAnsi="David" w:cs="David"/>
           <w:lang w:val="en-US"/>
         </w:rPr>
-        <w:t xml:space="preserve">Sigmoid = converting the predicted values using sigmoid function, </w:t>
-      </w:r>
-      <w:proofErr w:type="gramStart"/>
-      <w:r>
-        <w:rPr>
-          <w:rFonts w:ascii="David" w:hAnsi="David" w:cs="David"/>
-          <w:lang w:val="en-US"/>
-        </w:rPr>
-        <w:t>than</w:t>
-      </w:r>
-      <w:proofErr w:type="gramEnd"/>
-      <w:r>
-        <w:rPr>
-          <w:rFonts w:ascii="David" w:hAnsi="David" w:cs="David"/>
-          <w:lang w:val="en-US"/>
-        </w:rPr>
-        <w:t xml:space="preserve"> probabilities over 0.5 are considered links.</w:t>
+        <w:t>Sigmoid = converting the predicted values using sigmoid function, than probabilities over 0.5 are considered links.</w:t>
       </w:r>
     </w:p>
     <w:p>
@@ -799,7 +594,7 @@
         </w:rPr>
         <w:lastRenderedPageBreak/>
         <w:drawing>
-          <wp:inline distT="0" distB="0" distL="0" distR="0" wp14:anchorId="7018F8A3" wp14:editId="5275A67F">
+          <wp:inline distT="0" distB="0" distL="0" distR="0" wp14:anchorId="7018F8A3" wp14:editId="6F20A14F">
             <wp:extent cx="7277864" cy="3699644"/>
             <wp:effectExtent l="0" t="0" r="0" b="0"/>
             <wp:docPr id="946855315" name="Picture 2"/>
@@ -866,7 +661,7 @@
           <w:lang w:val="en-US"/>
         </w:rPr>
         <w:drawing>
-          <wp:inline distT="0" distB="0" distL="0" distR="0" wp14:anchorId="7CA25923" wp14:editId="738F106A">
+          <wp:inline distT="0" distB="0" distL="0" distR="0" wp14:anchorId="7CA25923" wp14:editId="4FF7C3D5">
             <wp:extent cx="7301012" cy="3711411"/>
             <wp:effectExtent l="0" t="0" r="0" b="3810"/>
             <wp:docPr id="1522771385" name="Picture 4"/>
@@ -916,64 +711,23 @@
           <w:rFonts w:ascii="David" w:hAnsi="David" w:cs="David"/>
           <w:lang w:val="en-US"/>
         </w:rPr>
-        <w:t xml:space="preserve">the min-max looks like the worse option since it cannot calculate the f1 score in some cases. The sigmoid and prob above 0 have similar results, with higher maximal f1 than sigmoid </w:t>
-      </w:r>
-      <w:proofErr w:type="gramStart"/>
-      <w:r>
-        <w:rPr>
-          <w:rFonts w:ascii="David" w:hAnsi="David" w:cs="David"/>
-          <w:lang w:val="en-US"/>
-        </w:rPr>
-        <w:t>0.5 .</w:t>
-      </w:r>
-      <w:proofErr w:type="gramEnd"/>
-      <w:r>
-        <w:rPr>
-          <w:rFonts w:ascii="David" w:hAnsi="David" w:cs="David"/>
-          <w:lang w:val="en-US"/>
-        </w:rPr>
-        <w:t xml:space="preserve"> </w:t>
-      </w:r>
-    </w:p>
-    <w:p>
-      <w:pPr>
-        <w:rPr>
-          <w:rFonts w:ascii="David" w:hAnsi="David" w:cs="David"/>
-          <w:lang w:val="en-US"/>
-        </w:rPr>
-      </w:pPr>
-      <w:r>
-        <w:rPr>
-          <w:rFonts w:ascii="David" w:hAnsi="David" w:cs="David"/>
-          <w:lang w:val="en-US"/>
-        </w:rPr>
-        <w:t xml:space="preserve">Max f1 for </w:t>
-      </w:r>
-      <w:proofErr w:type="spellStart"/>
-      <w:r>
-        <w:rPr>
-          <w:rFonts w:ascii="David" w:hAnsi="David" w:cs="David"/>
-          <w:lang w:val="en-US"/>
-        </w:rPr>
-        <w:t>sigm</w:t>
-      </w:r>
-      <w:proofErr w:type="spellEnd"/>
-      <w:r>
-        <w:rPr>
-          <w:rFonts w:ascii="David" w:hAnsi="David" w:cs="David"/>
-          <w:lang w:val="en-US"/>
-        </w:rPr>
-        <w:t xml:space="preserve"> and &gt; 0 are the same (checked on 1 iteration in the Canaries): </w:t>
-      </w:r>
-      <w:proofErr w:type="gramStart"/>
-      <w:r>
-        <w:rPr>
-          <w:rFonts w:ascii="David" w:hAnsi="David" w:cs="David"/>
-          <w:lang w:val="en-US"/>
-        </w:rPr>
-        <w:t>0.72 .</w:t>
-      </w:r>
-      <w:proofErr w:type="gramEnd"/>
+        <w:t xml:space="preserve">the min-max looks like the worse option since it cannot calculate the f1 score in some cases. The sigmoid and prob above 0 have similar results, with higher maximal f1 than sigmoid 0.5 . </w:t>
+      </w:r>
+    </w:p>
+    <w:p>
+      <w:pPr>
+        <w:rPr>
+          <w:rFonts w:ascii="David" w:hAnsi="David" w:cs="David"/>
+          <w:lang w:val="en-US"/>
+        </w:rPr>
+      </w:pPr>
+      <w:r>
+        <w:rPr>
+          <w:rFonts w:ascii="David" w:hAnsi="David" w:cs="David"/>
+          <w:lang w:val="en-US"/>
+        </w:rPr>
+        <w:t>Max f1 for sigm and &gt; 0 are the same (checked on 1 iteration in the Canaries): 0.72 .</w:t>
+      </w:r>
     </w:p>
     <w:p>
       <w:pPr>
@@ -988,23 +742,7 @@
           <w:lang w:val="en-US"/>
         </w:rPr>
         <w:lastRenderedPageBreak/>
-        <w:t xml:space="preserve">Average f1 </w:t>
-      </w:r>
-      <w:proofErr w:type="spellStart"/>
-      <w:r>
-        <w:rPr>
-          <w:rFonts w:ascii="David" w:hAnsi="David" w:cs="David"/>
-          <w:lang w:val="en-US"/>
-        </w:rPr>
-        <w:t>sigm</w:t>
-      </w:r>
-      <w:proofErr w:type="spellEnd"/>
-      <w:r>
-        <w:rPr>
-          <w:rFonts w:ascii="David" w:hAnsi="David" w:cs="David"/>
-          <w:lang w:val="en-US"/>
-        </w:rPr>
-        <w:t xml:space="preserve"> = 0.468, average f1 &gt; 0 = 0.476. </w:t>
+        <w:t xml:space="preserve">Average f1 sigm = 0.468, average f1 &gt; 0 = 0.476. </w:t>
       </w:r>
       <w:r>
         <w:rPr>
@@ -1120,23 +858,7 @@
           <w:rFonts w:ascii="David" w:hAnsi="David" w:cs="David"/>
           <w:lang w:val="en-US"/>
         </w:rPr>
-        <w:t xml:space="preserve">The predictions for the </w:t>
-      </w:r>
-      <w:proofErr w:type="gramStart"/>
-      <w:r>
-        <w:rPr>
-          <w:rFonts w:ascii="David" w:hAnsi="David" w:cs="David"/>
-          <w:lang w:val="en-US"/>
-        </w:rPr>
-        <w:t>off-diagonals</w:t>
-      </w:r>
-      <w:proofErr w:type="gramEnd"/>
-      <w:r>
-        <w:rPr>
-          <w:rFonts w:ascii="David" w:hAnsi="David" w:cs="David"/>
-          <w:lang w:val="en-US"/>
-        </w:rPr>
-        <w:t xml:space="preserve"> are actually better than for the diagonal.</w:t>
+        <w:t>The predictions for the off-diagonals are actually better than for the diagonal.</w:t>
       </w:r>
     </w:p>
     <w:p>
@@ -1193,23 +915,7 @@
           <w:rFonts w:ascii="David" w:hAnsi="David" w:cs="David"/>
           <w:lang w:val="en-US"/>
         </w:rPr>
-        <w:t xml:space="preserve">We reduced the number of bootstrapping iterations from 100 to 10 since 100 iterations yield huge </w:t>
-      </w:r>
-      <w:proofErr w:type="spellStart"/>
-      <w:r>
-        <w:rPr>
-          <w:rFonts w:ascii="David" w:hAnsi="David" w:cs="David"/>
-          <w:lang w:val="en-US"/>
-        </w:rPr>
-        <w:t>csvs</w:t>
-      </w:r>
-      <w:proofErr w:type="spellEnd"/>
-      <w:r>
-        <w:rPr>
-          <w:rFonts w:ascii="David" w:hAnsi="David" w:cs="David"/>
-          <w:lang w:val="en-US"/>
-        </w:rPr>
-        <w:t>.</w:t>
+        <w:t>We reduced the number of bootstrapping iterations from 100 to 10 since 100 iterations yield huge csvs.</w:t>
       </w:r>
     </w:p>
     <w:p>
@@ -1287,39 +993,8 @@
           <w:bCs/>
           <w:lang w:val="en-US"/>
         </w:rPr>
-        <w:t xml:space="preserve">Links are considered as ones if sigmoid prob based on the predicted </w:t>
-      </w:r>
-      <w:proofErr w:type="spellStart"/>
-      <w:r>
-        <w:rPr>
-          <w:rFonts w:ascii="David" w:hAnsi="David" w:cs="David"/>
-          <w:b/>
-          <w:bCs/>
-          <w:lang w:val="en-US"/>
-        </w:rPr>
-        <w:t>svd</w:t>
-      </w:r>
-      <w:proofErr w:type="spellEnd"/>
-      <w:r>
-        <w:rPr>
-          <w:rFonts w:ascii="David" w:hAnsi="David" w:cs="David"/>
-          <w:b/>
-          <w:bCs/>
-          <w:lang w:val="en-US"/>
-        </w:rPr>
-        <w:t xml:space="preserve"> value is larger than </w:t>
-      </w:r>
-      <w:proofErr w:type="gramStart"/>
-      <w:r>
-        <w:rPr>
-          <w:rFonts w:ascii="David" w:hAnsi="David" w:cs="David"/>
-          <w:b/>
-          <w:bCs/>
-          <w:lang w:val="en-US"/>
-        </w:rPr>
-        <w:t>0.5 .</w:t>
-      </w:r>
-      <w:proofErr w:type="gramEnd"/>
+        <w:t>Links are considered as ones if sigmoid prob based on the predicted svd value is larger than 0.5 .</w:t>
+      </w:r>
     </w:p>
     <w:p>
       <w:pPr>
@@ -1350,21 +1025,12 @@
         </w:rPr>
         <w:t xml:space="preserve">what appears to be, at first, </w:t>
       </w:r>
-      <w:proofErr w:type="spellStart"/>
-      <w:r>
-        <w:rPr>
-          <w:rFonts w:ascii="David" w:hAnsi="David" w:cs="David"/>
-          <w:lang w:val="en-US"/>
-        </w:rPr>
-        <w:t>non intuitive</w:t>
-      </w:r>
-      <w:proofErr w:type="spellEnd"/>
-      <w:r>
-        <w:rPr>
-          <w:rFonts w:ascii="David" w:hAnsi="David" w:cs="David"/>
-          <w:lang w:val="en-US"/>
-        </w:rPr>
-        <w:t xml:space="preserve"> results.</w:t>
+      <w:r>
+        <w:rPr>
+          <w:rFonts w:ascii="David" w:hAnsi="David" w:cs="David"/>
+          <w:lang w:val="en-US"/>
+        </w:rPr>
+        <w:t>non intuitive results.</w:t>
       </w:r>
     </w:p>
     <w:p>
@@ -1698,23 +1364,7 @@
           <w:rFonts w:ascii="David" w:hAnsi="David" w:cs="David"/>
           <w:lang w:val="en-US"/>
         </w:rPr>
-        <w:t xml:space="preserve">It shows marginally significant results, that in my opinion is </w:t>
-      </w:r>
-      <w:proofErr w:type="gramStart"/>
-      <w:r>
-        <w:rPr>
-          <w:rFonts w:ascii="David" w:hAnsi="David" w:cs="David"/>
-          <w:lang w:val="en-US"/>
-        </w:rPr>
-        <w:t>actually meaningful</w:t>
-      </w:r>
-      <w:proofErr w:type="gramEnd"/>
-      <w:r>
-        <w:rPr>
-          <w:rFonts w:ascii="David" w:hAnsi="David" w:cs="David"/>
-          <w:lang w:val="en-US"/>
-        </w:rPr>
-        <w:t>.</w:t>
+        <w:t>It shows marginally significant results, that in my opinion is actually meaningful.</w:t>
       </w:r>
     </w:p>
     <w:p>
@@ -1753,29 +1403,7 @@
           <w:color w:val="FF0000"/>
           <w:lang w:val="en-US"/>
         </w:rPr>
-        <w:t xml:space="preserve"> (make sure that you used the same </w:t>
-      </w:r>
-      <w:proofErr w:type="gramStart"/>
-      <w:r>
-        <w:rPr>
-          <w:rFonts w:ascii="David" w:hAnsi="David" w:cs="David"/>
-          <w:b/>
-          <w:bCs/>
-          <w:color w:val="FF0000"/>
-          <w:lang w:val="en-US"/>
-        </w:rPr>
-        <w:t>off-diagonal</w:t>
-      </w:r>
-      <w:proofErr w:type="gramEnd"/>
-      <w:r>
-        <w:rPr>
-          <w:rFonts w:ascii="David" w:hAnsi="David" w:cs="David"/>
-          <w:b/>
-          <w:bCs/>
-          <w:color w:val="FF0000"/>
-          <w:lang w:val="en-US"/>
-        </w:rPr>
-        <w:t xml:space="preserve"> in all)</w:t>
+        <w:t xml:space="preserve"> (make sure that you used the same off-diagonal in all)</w:t>
       </w:r>
     </w:p>
     <w:p>
@@ -2067,7 +1695,6 @@
         </w:rPr>
         <w:t xml:space="preserve">predictive capacity for the </w:t>
       </w:r>
-      <w:proofErr w:type="gramStart"/>
       <w:r>
         <w:rPr>
           <w:rFonts w:ascii="David" w:hAnsi="David" w:cs="David"/>
@@ -2080,15 +1707,7 @@
           <w:rFonts w:ascii="David" w:hAnsi="David" w:cs="David"/>
           <w:lang w:val="en-US"/>
         </w:rPr>
-        <w:t xml:space="preserve"> is</w:t>
-      </w:r>
-      <w:proofErr w:type="gramEnd"/>
-      <w:r>
-        <w:rPr>
-          <w:rFonts w:ascii="David" w:hAnsi="David" w:cs="David"/>
-          <w:lang w:val="en-US"/>
-        </w:rPr>
-        <w:t xml:space="preserve"> lower in comparison to the off-diagonals</w:t>
+        <w:t xml:space="preserve"> is lower in comparison to the off-diagonals</w:t>
       </w:r>
       <w:r>
         <w:rPr>
@@ -2115,29 +1734,7 @@
           <w:rtl/>
           <w:lang w:val="en-US"/>
         </w:rPr>
-        <w:t xml:space="preserve">יש חשיבות לאילו לינקים מורידים. לכן טוב עשינו כשמיצענו </w:t>
-      </w:r>
-      <w:proofErr w:type="spellStart"/>
-      <w:r>
-        <w:rPr>
-          <w:rFonts w:ascii="David" w:hAnsi="David" w:cs="David" w:hint="cs"/>
-          <w:b/>
-          <w:bCs/>
-          <w:rtl/>
-          <w:lang w:val="en-US"/>
-        </w:rPr>
-        <w:t>איטרציות</w:t>
-      </w:r>
-      <w:proofErr w:type="spellEnd"/>
-      <w:r>
-        <w:rPr>
-          <w:rFonts w:ascii="David" w:hAnsi="David" w:cs="David" w:hint="cs"/>
-          <w:b/>
-          <w:bCs/>
-          <w:rtl/>
-          <w:lang w:val="en-US"/>
-        </w:rPr>
-        <w:t>.</w:t>
+        <w:t>יש חשיבות לאילו לינקים מורידים. לכן טוב עשינו כשמיצענו איטרציות.</w:t>
       </w:r>
     </w:p>
     <w:p>
@@ -2641,9 +2238,16 @@
           <w:rtl/>
           <w:lang w:val="en-US"/>
         </w:rPr>
-        <w:t xml:space="preserve">להכין </w:t>
-      </w:r>
-      <w:proofErr w:type="spellStart"/>
+        <w:t xml:space="preserve">להכין פלוטים על </w:t>
+      </w:r>
+      <w:r>
+        <w:rPr>
+          <w:rFonts w:ascii="David" w:hAnsi="David" w:cs="David"/>
+          <w:color w:val="FF0000"/>
+          <w:lang w:val="en-US"/>
+        </w:rPr>
+        <w:t>facets</w:t>
+      </w:r>
       <w:r>
         <w:rPr>
           <w:rFonts w:ascii="David" w:hAnsi="David" w:cs="David" w:hint="cs"/>
@@ -2651,9 +2255,26 @@
           <w:rtl/>
           <w:lang w:val="en-US"/>
         </w:rPr>
-        <w:t>פלוטים</w:t>
-      </w:r>
-      <w:proofErr w:type="spellEnd"/>
+        <w:t xml:space="preserve"> של: </w:t>
+      </w:r>
+      <w:r>
+        <w:rPr>
+          <w:rFonts w:ascii="David" w:hAnsi="David" w:cs="David"/>
+          <w:color w:val="FF0000"/>
+          <w:lang w:val="en-US"/>
+        </w:rPr>
+        <w:t>size P, size C, density P, density C</w:t>
+      </w:r>
+    </w:p>
+    <w:p>
+      <w:pPr>
+        <w:bidi/>
+        <w:rPr>
+          <w:rFonts w:ascii="David" w:hAnsi="David" w:cs="David"/>
+          <w:color w:val="FF0000"/>
+          <w:lang w:val="en-US"/>
+        </w:rPr>
+      </w:pPr>
       <w:r>
         <w:rPr>
           <w:rFonts w:ascii="David" w:hAnsi="David" w:cs="David" w:hint="cs"/>
@@ -2661,7 +2282,7 @@
           <w:rtl/>
           <w:lang w:val="en-US"/>
         </w:rPr>
-        <w:t xml:space="preserve"> על </w:t>
+        <w:t xml:space="preserve">עבור </w:t>
       </w:r>
       <w:r>
         <w:rPr>
@@ -2669,126 +2290,26 @@
           <w:color w:val="FF0000"/>
           <w:lang w:val="en-US"/>
         </w:rPr>
-        <w:t>facets</w:t>
-      </w:r>
-      <w:r>
-        <w:rPr>
-          <w:rFonts w:ascii="David" w:hAnsi="David" w:cs="David" w:hint="cs"/>
+        <w:t>1 diag+ diag</w:t>
+      </w:r>
+    </w:p>
+    <w:p>
+      <w:pPr>
+        <w:bidi/>
+        <w:rPr>
+          <w:rFonts w:ascii="David" w:hAnsi="David" w:cs="David"/>
           <w:color w:val="FF0000"/>
-          <w:rtl/>
-          <w:lang w:val="en-US"/>
-        </w:rPr>
-        <w:t xml:space="preserve"> של: </w:t>
-      </w:r>
+          <w:lang w:val="en-US"/>
+        </w:rPr>
+      </w:pPr>
       <w:r>
         <w:rPr>
           <w:rFonts w:ascii="David" w:hAnsi="David" w:cs="David"/>
           <w:color w:val="FF0000"/>
           <w:lang w:val="en-US"/>
         </w:rPr>
-        <w:t>size P, size C, density P, density C</w:t>
-      </w:r>
-    </w:p>
-    <w:p>
-      <w:pPr>
-        <w:bidi/>
-        <w:rPr>
-          <w:rFonts w:ascii="David" w:hAnsi="David" w:cs="David"/>
-          <w:color w:val="FF0000"/>
-          <w:lang w:val="en-US"/>
-        </w:rPr>
-      </w:pPr>
-      <w:r>
-        <w:rPr>
-          <w:rFonts w:ascii="David" w:hAnsi="David" w:cs="David" w:hint="cs"/>
-          <w:color w:val="FF0000"/>
-          <w:rtl/>
-          <w:lang w:val="en-US"/>
-        </w:rPr>
-        <w:t xml:space="preserve">עבור </w:t>
-      </w:r>
-      <w:r>
-        <w:rPr>
-          <w:rFonts w:ascii="David" w:hAnsi="David" w:cs="David"/>
-          <w:color w:val="FF0000"/>
-          <w:lang w:val="en-US"/>
-        </w:rPr>
-        <w:t xml:space="preserve">1 </w:t>
-      </w:r>
-      <w:proofErr w:type="spellStart"/>
-      <w:r>
-        <w:rPr>
-          <w:rFonts w:ascii="David" w:hAnsi="David" w:cs="David"/>
-          <w:color w:val="FF0000"/>
-          <w:lang w:val="en-US"/>
-        </w:rPr>
-        <w:t>diag</w:t>
-      </w:r>
-      <w:proofErr w:type="spellEnd"/>
-      <w:r>
-        <w:rPr>
-          <w:rFonts w:ascii="David" w:hAnsi="David" w:cs="David"/>
-          <w:color w:val="FF0000"/>
-          <w:lang w:val="en-US"/>
-        </w:rPr>
-        <w:t xml:space="preserve">+ </w:t>
-      </w:r>
-      <w:proofErr w:type="spellStart"/>
-      <w:r>
-        <w:rPr>
-          <w:rFonts w:ascii="David" w:hAnsi="David" w:cs="David"/>
-          <w:color w:val="FF0000"/>
-          <w:lang w:val="en-US"/>
-        </w:rPr>
-        <w:t>diag</w:t>
-      </w:r>
-      <w:proofErr w:type="spellEnd"/>
-    </w:p>
-    <w:p>
-      <w:pPr>
-        <w:bidi/>
-        <w:rPr>
-          <w:rFonts w:ascii="David" w:hAnsi="David" w:cs="David"/>
-          <w:color w:val="FF0000"/>
-          <w:lang w:val="en-US"/>
-        </w:rPr>
-      </w:pPr>
-      <w:r>
-        <w:rPr>
-          <w:rFonts w:ascii="David" w:hAnsi="David" w:cs="David"/>
-          <w:color w:val="FF0000"/>
-          <w:lang w:val="en-US"/>
-        </w:rPr>
-        <w:t xml:space="preserve">1 </w:t>
-      </w:r>
-      <w:proofErr w:type="spellStart"/>
-      <w:r>
-        <w:rPr>
-          <w:rFonts w:ascii="David" w:hAnsi="David" w:cs="David"/>
-          <w:color w:val="FF0000"/>
-          <w:lang w:val="en-US"/>
-        </w:rPr>
-        <w:t>diag</w:t>
-      </w:r>
-      <w:proofErr w:type="spellEnd"/>
-      <w:r>
-        <w:rPr>
-          <w:rFonts w:ascii="David" w:hAnsi="David" w:cs="David"/>
-          <w:color w:val="FF0000"/>
-          <w:lang w:val="en-US"/>
-        </w:rPr>
-        <w:t xml:space="preserve"> no </w:t>
-      </w:r>
-      <w:proofErr w:type="spellStart"/>
-      <w:r>
-        <w:rPr>
-          <w:rFonts w:ascii="David" w:hAnsi="David" w:cs="David"/>
-          <w:color w:val="FF0000"/>
-          <w:lang w:val="en-US"/>
-        </w:rPr>
-        <w:t>diag</w:t>
-      </w:r>
-      <w:proofErr w:type="spellEnd"/>
+        <w:t>1 diag no diag</w:t>
+      </w:r>
     </w:p>
     <w:p>
       <w:pPr>
@@ -2878,6 +2399,27 @@
           <w:rFonts w:ascii="David" w:hAnsi="David" w:cs="David"/>
           <w:b/>
           <w:bCs/>
+          <w:color w:val="000000" w:themeColor="text1"/>
+          <w:lang w:val="en-US"/>
+        </w:rPr>
+      </w:pPr>
+      <w:r>
+        <w:rPr>
+          <w:rFonts w:ascii="David" w:hAnsi="David" w:cs="David"/>
+          <w:b/>
+          <w:bCs/>
+          <w:color w:val="000000" w:themeColor="text1"/>
+          <w:lang w:val="en-US"/>
+        </w:rPr>
+        <w:t>The results of the evaluators are average of all 10 iterations.</w:t>
+      </w:r>
+    </w:p>
+    <w:p>
+      <w:pPr>
+        <w:rPr>
+          <w:rFonts w:ascii="David" w:hAnsi="David" w:cs="David"/>
+          <w:b/>
+          <w:bCs/>
           <w:lang w:val="en-US"/>
         </w:rPr>
       </w:pPr>
@@ -2918,21 +2460,12 @@
           <w:lang w:val="en-US"/>
         </w:rPr>
       </w:pPr>
-      <w:proofErr w:type="gramStart"/>
-      <w:r>
-        <w:rPr>
-          <w:rFonts w:ascii="David" w:hAnsi="David" w:cs="David"/>
-          <w:lang w:val="en-US"/>
-        </w:rPr>
-        <w:t>Overall</w:t>
-      </w:r>
-      <w:proofErr w:type="gramEnd"/>
-      <w:r>
-        <w:rPr>
-          <w:rFonts w:ascii="David" w:hAnsi="David" w:cs="David"/>
-          <w:lang w:val="en-US"/>
-        </w:rPr>
-        <w:t xml:space="preserve"> Bray-Curtis similarity (all layer-to layer predictions, plants and pollinators combined):</w:t>
+      <w:r>
+        <w:rPr>
+          <w:rFonts w:ascii="David" w:hAnsi="David" w:cs="David"/>
+          <w:lang w:val="en-US"/>
+        </w:rPr>
+        <w:t>Overall Bray-Curtis similarity (all layer-to layer predictions, plants and pollinators combined):</w:t>
       </w:r>
     </w:p>
     <w:p>
@@ -3029,7 +2562,29 @@
           <w:rFonts w:ascii="David" w:hAnsi="David" w:cs="David"/>
           <w:lang w:val="en-US"/>
         </w:rPr>
-        <w:t>for 1 off-diagonal:</w:t>
+        <w:t>for 1 off-diagonal</w:t>
+      </w:r>
+      <w:r>
+        <w:rPr>
+          <w:rFonts w:ascii="David" w:hAnsi="David" w:cs="David" w:hint="cs"/>
+          <w:rtl/>
+          <w:lang w:val="en-US"/>
+        </w:rPr>
+        <w:t>+</w:t>
+      </w:r>
+      <w:r>
+        <w:rPr>
+          <w:rFonts w:ascii="David" w:hAnsi="David" w:cs="David"/>
+          <w:lang w:val="en-US"/>
+        </w:rPr>
+        <w:t>diagonal</w:t>
+      </w:r>
+      <w:r>
+        <w:rPr>
+          <w:rFonts w:ascii="David" w:hAnsi="David" w:cs="David"/>
+          <w:lang w:val="en-US"/>
+        </w:rPr>
+        <w:t>:</w:t>
       </w:r>
     </w:p>
     <w:p>
@@ -3108,6 +2663,7 @@
           <w:rFonts w:ascii="David" w:hAnsi="David" w:cs="David"/>
           <w:lang w:val="en-US"/>
         </w:rPr>
+        <w:lastRenderedPageBreak/>
         <w:t>Jaccard:</w:t>
       </w:r>
     </w:p>
@@ -3122,7 +2678,6 @@
         <w:rPr>
           <w:noProof/>
         </w:rPr>
-        <w:lastRenderedPageBreak/>
         <w:drawing>
           <wp:inline distT="0" distB="0" distL="0" distR="0" wp14:anchorId="10A2A8C5" wp14:editId="0689E8E4">
             <wp:extent cx="5244490" cy="4427484"/>
@@ -3357,38 +2912,40 @@
           <w:rtl/>
           <w:lang w:val="en-US"/>
         </w:rPr>
-        <w:t xml:space="preserve"> בכל </w:t>
-      </w:r>
-      <w:proofErr w:type="spellStart"/>
-      <w:r>
-        <w:rPr>
-          <w:rFonts w:ascii="David" w:hAnsi="David" w:cs="David" w:hint="cs"/>
+        <w:t xml:space="preserve"> בכל הפלוטים ומספר ספרות. להוסיף שנתות.</w:t>
+      </w:r>
+    </w:p>
+    <w:p>
+      <w:pPr>
+        <w:bidi/>
+        <w:rPr>
+          <w:rFonts w:ascii="David" w:hAnsi="David" w:cs="David"/>
           <w:color w:val="FF0000"/>
+          <w:lang w:val="en-US"/>
+        </w:rPr>
+      </w:pPr>
+    </w:p>
+    <w:p>
+      <w:pPr>
+        <w:rPr>
+          <w:rFonts w:ascii="David" w:hAnsi="David" w:cs="David"/>
+          <w:b/>
+          <w:bCs/>
+          <w:color w:val="000000" w:themeColor="text1"/>
           <w:rtl/>
           <w:lang w:val="en-US"/>
         </w:rPr>
-        <w:t>הפלוטים</w:t>
-      </w:r>
-      <w:proofErr w:type="spellEnd"/>
-      <w:r>
-        <w:rPr>
-          <w:rFonts w:ascii="David" w:hAnsi="David" w:cs="David" w:hint="cs"/>
-          <w:color w:val="FF0000"/>
-          <w:rtl/>
-          <w:lang w:val="en-US"/>
-        </w:rPr>
-        <w:t xml:space="preserve"> ומספר ספרות. להוסיף שנתות.</w:t>
-      </w:r>
-    </w:p>
-    <w:p>
-      <w:pPr>
-        <w:bidi/>
-        <w:rPr>
-          <w:rFonts w:ascii="David" w:hAnsi="David" w:cs="David"/>
-          <w:color w:val="FF0000"/>
-          <w:lang w:val="en-US"/>
-        </w:rPr>
-      </w:pPr>
+      </w:pPr>
+      <w:r>
+        <w:rPr>
+          <w:rFonts w:ascii="David" w:hAnsi="David" w:cs="David"/>
+          <w:b/>
+          <w:bCs/>
+          <w:color w:val="000000" w:themeColor="text1"/>
+          <w:lang w:val="en-US"/>
+        </w:rPr>
+        <w:t>Using predictions for weighted interactions</w:t>
+      </w:r>
     </w:p>
     <w:p>
       <w:pPr>
@@ -3656,10 +3213,20 @@
       <w:r>
         <w:rPr>
           <w:rFonts w:ascii="David" w:hAnsi="David" w:cs="David"/>
-          <w:color w:val="000000" w:themeColor="text1"/>
-          <w:lang w:val="en-US"/>
-        </w:rPr>
-        <w:t>Plants:</w:t>
+          <w:b/>
+          <w:bCs/>
+          <w:color w:val="000000" w:themeColor="text1"/>
+          <w:lang w:val="en-US"/>
+        </w:rPr>
+        <w:t>Plants</w:t>
+      </w:r>
+      <w:r>
+        <w:rPr>
+          <w:rFonts w:ascii="David" w:hAnsi="David" w:cs="David"/>
+          <w:color w:val="000000" w:themeColor="text1"/>
+          <w:lang w:val="en-US"/>
+        </w:rPr>
+        <w:t>:</w:t>
       </w:r>
     </w:p>
     <w:p>
@@ -3840,6 +3407,8 @@
       <w:r>
         <w:rPr>
           <w:rFonts w:ascii="David" w:hAnsi="David" w:cs="David"/>
+          <w:b/>
+          <w:bCs/>
           <w:color w:val="000000" w:themeColor="text1"/>
           <w:lang w:val="en-US"/>
         </w:rPr>
@@ -3919,6 +3488,201 @@
             </a:graphic>
           </wp:inline>
         </w:drawing>
+      </w:r>
+    </w:p>
+    <w:p>
+      <w:pPr>
+        <w:rPr>
+          <w:rFonts w:ascii="David" w:hAnsi="David" w:cs="David"/>
+          <w:color w:val="000000" w:themeColor="text1"/>
+          <w:lang w:val="en-US"/>
+        </w:rPr>
+      </w:pPr>
+    </w:p>
+    <w:p>
+      <w:pPr>
+        <w:rPr>
+          <w:rFonts w:ascii="David" w:hAnsi="David" w:cs="David"/>
+          <w:b/>
+          <w:bCs/>
+          <w:color w:val="000000" w:themeColor="text1"/>
+          <w:lang w:val="en-US"/>
+        </w:rPr>
+      </w:pPr>
+      <w:r>
+        <w:rPr>
+          <w:rFonts w:ascii="David" w:hAnsi="David" w:cs="David"/>
+          <w:b/>
+          <w:bCs/>
+          <w:color w:val="000000" w:themeColor="text1"/>
+          <w:lang w:val="en-US"/>
+        </w:rPr>
+        <w:t>20 most significant interactions that were not observed (original links == 0) and have sigmoid observed value larger than 0.5:</w:t>
+      </w:r>
+    </w:p>
+    <w:p>
+      <w:pPr>
+        <w:rPr>
+          <w:rFonts w:ascii="David" w:hAnsi="David" w:cs="David"/>
+          <w:b/>
+          <w:bCs/>
+          <w:color w:val="000000" w:themeColor="text1"/>
+          <w:lang w:val="en-US"/>
+        </w:rPr>
+      </w:pPr>
+      <w:r>
+        <w:rPr>
+          <w:rFonts w:ascii="David" w:hAnsi="David" w:cs="David"/>
+          <w:b/>
+          <w:bCs/>
+          <w:noProof/>
+          <w:color w:val="000000" w:themeColor="text1"/>
+          <w:lang w:val="en-US"/>
+        </w:rPr>
+        <w:drawing>
+          <wp:inline distT="0" distB="0" distL="0" distR="0" wp14:anchorId="430A6D08" wp14:editId="37262DAA">
+            <wp:extent cx="5185883" cy="4380499"/>
+            <wp:effectExtent l="0" t="0" r="0" b="1270"/>
+            <wp:docPr id="1227321864" name="Picture 1"/>
+            <wp:cNvGraphicFramePr>
+              <a:graphicFrameLocks xmlns:a="http://schemas.openxmlformats.org/drawingml/2006/main" noChangeAspect="1"/>
+            </wp:cNvGraphicFramePr>
+            <a:graphic xmlns:a="http://schemas.openxmlformats.org/drawingml/2006/main">
+              <a:graphicData uri="http://schemas.openxmlformats.org/drawingml/2006/picture">
+                <pic:pic xmlns:pic="http://schemas.openxmlformats.org/drawingml/2006/picture">
+                  <pic:nvPicPr>
+                    <pic:cNvPr id="1227321864" name="Picture 1"/>
+                    <pic:cNvPicPr/>
+                  </pic:nvPicPr>
+                  <pic:blipFill>
+                    <a:blip r:embed="rId29" cstate="print">
+                      <a:extLst>
+                        <a:ext uri="{28A0092B-C50C-407E-A947-70E740481C1C}">
+                          <a14:useLocalDpi xmlns:a14="http://schemas.microsoft.com/office/drawing/2010/main" val="0"/>
+                        </a:ext>
+                      </a:extLst>
+                    </a:blip>
+                    <a:stretch>
+                      <a:fillRect/>
+                    </a:stretch>
+                  </pic:blipFill>
+                  <pic:spPr>
+                    <a:xfrm>
+                      <a:off x="0" y="0"/>
+                      <a:ext cx="5185883" cy="4380499"/>
+                    </a:xfrm>
+                    <a:prstGeom prst="rect">
+                      <a:avLst/>
+                    </a:prstGeom>
+                  </pic:spPr>
+                </pic:pic>
+              </a:graphicData>
+            </a:graphic>
+          </wp:inline>
+        </w:drawing>
+      </w:r>
+    </w:p>
+    <w:p>
+      <w:pPr>
+        <w:rPr>
+          <w:rFonts w:ascii="David" w:hAnsi="David" w:cs="David"/>
+          <w:color w:val="000000" w:themeColor="text1"/>
+          <w:lang w:val="en-US"/>
+        </w:rPr>
+      </w:pPr>
+      <w:r>
+        <w:rPr>
+          <w:rFonts w:ascii="David" w:hAnsi="David" w:cs="David"/>
+          <w:color w:val="000000" w:themeColor="text1"/>
+          <w:lang w:val="en-US"/>
+        </w:rPr>
+        <w:lastRenderedPageBreak/>
+        <w:t>This is based on the weighted data, taking into consideration all layer combinations and iterations. Only interactions that appear in the data enough times to conduct a t-test were taken into consideration in the analysis.</w:t>
+      </w:r>
+    </w:p>
+    <w:p>
+      <w:pPr>
+        <w:rPr>
+          <w:rFonts w:ascii="David" w:hAnsi="David" w:cs="David"/>
+          <w:color w:val="000000" w:themeColor="text1"/>
+          <w:lang w:val="en-US"/>
+        </w:rPr>
+      </w:pPr>
+    </w:p>
+    <w:p>
+      <w:pPr>
+        <w:rPr>
+          <w:rFonts w:ascii="David" w:hAnsi="David" w:cs="David"/>
+          <w:color w:val="FF0000"/>
+          <w:lang w:val="en-US"/>
+        </w:rPr>
+      </w:pPr>
+      <w:r>
+        <w:rPr>
+          <w:rFonts w:ascii="David" w:hAnsi="David" w:cs="David"/>
+          <w:color w:val="FF0000"/>
+          <w:lang w:val="en-US"/>
+        </w:rPr>
+        <w:t>Try to v</w:t>
+      </w:r>
+      <w:r>
+        <w:rPr>
+          <w:rFonts w:ascii="David" w:hAnsi="David" w:cs="David"/>
+          <w:color w:val="FF0000"/>
+          <w:lang w:val="en-US"/>
+        </w:rPr>
+        <w:t>alidate with Web of Life database</w:t>
+      </w:r>
+    </w:p>
+    <w:p>
+      <w:pPr>
+        <w:rPr>
+          <w:rFonts w:ascii="David" w:hAnsi="David" w:cs="David"/>
+          <w:color w:val="FF0000"/>
+          <w:lang w:val="en-US"/>
+        </w:rPr>
+      </w:pPr>
+      <w:r>
+        <w:rPr>
+          <w:rFonts w:ascii="David" w:hAnsi="David" w:cs="David"/>
+          <w:color w:val="FF0000"/>
+          <w:lang w:val="en-US"/>
+        </w:rPr>
+        <w:t>Run for binary-based predictions</w:t>
+      </w:r>
+    </w:p>
+    <w:p>
+      <w:pPr>
+        <w:rPr>
+          <w:rFonts w:ascii="David" w:hAnsi="David" w:cs="David"/>
+          <w:color w:val="FF0000"/>
+          <w:lang w:val="en-US"/>
+        </w:rPr>
+      </w:pPr>
+      <w:r>
+        <w:rPr>
+          <w:rFonts w:ascii="David" w:hAnsi="David" w:cs="David"/>
+          <w:color w:val="FF0000"/>
+          <w:lang w:val="en-US"/>
+        </w:rPr>
+        <w:t>Check what species are concentrated around pred-obs = 0</w:t>
+      </w:r>
+    </w:p>
+    <w:p>
+      <w:pPr>
+        <w:rPr>
+          <w:rFonts w:ascii="David" w:hAnsi="David" w:cs="David"/>
+          <w:color w:val="FF0000"/>
+          <w:lang w:val="en-US"/>
+        </w:rPr>
+      </w:pPr>
+      <w:r>
+        <w:rPr>
+          <w:rFonts w:ascii="David" w:hAnsi="David" w:cs="David"/>
+          <w:color w:val="FF0000"/>
+          <w:lang w:val="en-US"/>
+        </w:rPr>
+        <w:t>Check correlation with degree.</w:t>
       </w:r>
     </w:p>
     <w:p>

</xml_diff>